<commit_message>
docs: corrige el sentido de las preguntas del grafo de flujo
Las preguntas de decisión estaban en negativo (ej. "¿No existe el
estudiante?"), lo que obligaba a leer una doble negación para saber
qué rama tomar. Se reformulan en positivo ("¿Existe?", "¿Tiene
permiso?", "¿La carrera cursa la asignatura?", "¿La calificación es
válida?") de modo que "sí" siempre continúa el flujo normal y "no"
siempre lleva al error — salvo el nodo 14, que no es un error sino
que decide entre Aprobada y Pendiente. Se actualiza el .dot, el
.puml, la imagen, la tabla de caminos básicos y el Word del capítulo
3.2 para que coincidan.

Co-Authored-By: Claude Sonnet 5 <noreply@anthropic.com>
</commit_message>
<xml_diff>
--- a/docs/Pruebas de software - Capitulo 3.2.docx
+++ b/docs/Pruebas de software - Capitulo 3.2.docx
@@ -3767,7 +3767,7 @@
         <w:rPr>
           <w:rFonts w:ascii="Calibri" w:cs="Calibri" w:eastAsia="Calibri" w:hAnsi="Calibri"/>
         </w:rPr>
-        <w:t xml:space="preserve">El fragmento anterior contiene siete puntos de decisión: la verificación de existencia del estudiante, la verificación de existencia de la asignatura, la verificación de permisos del profesor sobre la asignatura, la verificación de que la carrera del estudiante cursa la asignatura, la verificación de si se envió una calificación, la verificación del rango válido de la calificación, y la expresión condicional que determina el estado final de la evaluación.</w:t>
+        <w:t xml:space="preserve">El fragmento anterior contiene siete puntos de decisión: la verificación de existencia del estudiante, la verificación de existencia de la asignatura, la verificación de permisos del profesor sobre la asignatura, la verificación de que la carrera del estudiante cursa la asignatura, la verificación de si se envió una calificación, la verificación del rango válido de la calificación, y la expresión condicional que determina el estado final de la evaluación. En el grafo (figura 3.1) cada pregunta se formuló en positivo (p. ej. "¿Existe el estudiante?" en vez de "¿No existe el estudiante?"), de modo que la rama "sí" siempre continúa el flujo normal y la rama "no" siempre lleva al error correspondiente — evitando la doble negación que resultaría de preguntar "¿No existe?" y responder "sí".</w:t>
       </w:r>
     </w:p>
     <w:p>
@@ -3843,7 +3843,7 @@
         <w:rPr>
           <w:rFonts w:ascii="Calibri" w:cs="Calibri" w:eastAsia="Calibri" w:hAnsi="Calibri"/>
         </w:rPr>
-        <w:t xml:space="preserve">Análisis del diagrama: el grafo representa el flujo de control del método registrar(). Cada nodo rectangular corresponde a una instrucción o bloque de instrucciones del código, y cada nodo romboidal corresponde a un punto de decisión; cada arista representa una posible transferencia de control entre dos nodos, etiquetada según el resultado de la condición evaluada (sí/no). El nodo 1 constituye el único punto de entrada del método, y el nodo "Fin" constituye su único punto de salida, al cual convergen las seis terminaciones posibles de la ejecución: las cinco excepciones controladas (nodos 3, 6, 8, 10 y 13) y el flujo normal que culmina en el almacenamiento de la evaluación (nodo 16). Cada camino distinto desde el nodo 1 hasta el nodo Fin —ocho en total— constituye un caso de prueba independiente, pues recorre al menos una arista que ningún otro camino recorre; por esa razón el número de caminos coincide exactamente con la complejidad ciclomática calculada. El hecho de que el grafo tenga un único punto de entrada y un único punto de salida es, además, la condición que valida el uso de la fórmula V(G) = aristas − nodos + 2 sobre este grafo.</w:t>
+        <w:t xml:space="preserve">Análisis del diagrama: el grafo representa el flujo de control del método registrar(). Cada nodo rectangular corresponde a una instrucción o bloque de instrucciones del código, y cada nodo romboidal corresponde a un punto de decisión, formulado siempre en sentido afirmativo; cada arista representa una posible transferencia de control entre dos nodos, etiquetada según el resultado de la condición evaluada (sí/no), de modo que la rama "sí" continúa el flujo normal y la rama "no" lleva al error correspondiente (excepto en el nodo 14, donde ninguna de las dos ramas es un error: decide entre Aprobada y Pendiente). El nodo 1 constituye el único punto de entrada del método, y el nodo "Fin" constituye su único punto de salida, al cual convergen las seis terminaciones posibles de la ejecución: las cinco excepciones controladas (nodos 3, 6, 8, 10 y 13) y el flujo normal que culmina en el almacenamiento de la evaluación (nodo 16). Cada camino distinto desde el nodo 1 hasta el nodo Fin —ocho en total— constituye un caso de prueba independiente, pues recorre al menos una arista que ningún otro camino recorre; por esa razón el número de caminos coincide exactamente con la complejidad ciclomática calculada. El hecho de que el grafo tenga un único punto de entrada y un único punto de salida es, además, la condición que valida el uso de la fórmula V(G) = aristas − nodos + 2 sobre este grafo.</w:t>
       </w:r>
     </w:p>
     <w:p>
@@ -4025,7 +4025,7 @@
                 <w:sz w:val="19"/>
                 <w:szCs w:val="19"/>
               </w:rPr>
-              <w:t xml:space="preserve">1→2(sí)→3→Fin</w:t>
+              <w:t xml:space="preserve">1→2(no)→3→Fin</w:t>
             </w:r>
           </w:p>
         </w:tc>
@@ -4105,7 +4105,7 @@
                 <w:sz w:val="19"/>
                 <w:szCs w:val="19"/>
               </w:rPr>
-              <w:t xml:space="preserve">1→2→4→5(sí)→6→Fin</w:t>
+              <w:t xml:space="preserve">1→2(sí)→4→5(no)→6→Fin</w:t>
             </w:r>
           </w:p>
         </w:tc>
@@ -4185,7 +4185,7 @@
                 <w:sz w:val="19"/>
                 <w:szCs w:val="19"/>
               </w:rPr>
-              <w:t xml:space="preserve">1→2→4→5→7(sí)→8→Fin</w:t>
+              <w:t xml:space="preserve">1→2→4→5(sí)→7(no)→8→Fin</w:t>
             </w:r>
           </w:p>
         </w:tc>
@@ -4265,7 +4265,7 @@
                 <w:sz w:val="19"/>
                 <w:szCs w:val="19"/>
               </w:rPr>
-              <w:t xml:space="preserve">1→2→4→5→7→9(sí)→10→Fin</w:t>
+              <w:t xml:space="preserve">1→2→4→5→7(sí)→9(no)→10→Fin</w:t>
             </w:r>
           </w:p>
         </w:tc>
@@ -4345,7 +4345,7 @@
                 <w:sz w:val="19"/>
                 <w:szCs w:val="19"/>
               </w:rPr>
-              <w:t xml:space="preserve">1→2→4→5→7→9(no)→11(sí)→12(sí)→13→Fin</w:t>
+              <w:t xml:space="preserve">1→2→4→5→7→9(sí)→11(sí)→12(no)→13→Fin</w:t>
             </w:r>
           </w:p>
         </w:tc>
@@ -4425,7 +4425,7 @@
                 <w:sz w:val="19"/>
                 <w:szCs w:val="19"/>
               </w:rPr>
-              <w:t xml:space="preserve">1→2→4→5→7→9→11(sí)→12(no)→14(sí)→15a→16→Fin</w:t>
+              <w:t xml:space="preserve">1→2→4→5→7→9→11(sí)→12(sí)→14(sí)→15a→16→Fin</w:t>
             </w:r>
           </w:p>
         </w:tc>
@@ -4505,7 +4505,7 @@
                 <w:sz w:val="19"/>
                 <w:szCs w:val="19"/>
               </w:rPr>
-              <w:t xml:space="preserve">1→2→4→5→7→9→11(sí)→12(no)→14(no)→15b→16→Fin</w:t>
+              <w:t xml:space="preserve">1→2→4→5→7→9→11(sí)→12(sí)→14(no)→15b→16→Fin</w:t>
             </w:r>
           </w:p>
         </w:tc>

</xml_diff>

<commit_message>
docs: aclara qué registra el método registrar() en las pruebas de caja blanca
Agrega un párrafo explicativo antes del código analizado: el método se
ejecuta cuando un profesor califica a un estudiante, guarda o actualiza
(upsert) la evaluación, valida existencia, permisos, carrera y rango de
la nota, y calcula el estado automáticamente.

Co-Authored-By: Claude Sonnet 5 <noreply@anthropic.com>
</commit_message>
<xml_diff>
--- a/docs/Pruebas de software - Capitulo 3.2.docx
+++ b/docs/Pruebas de software - Capitulo 3.2.docx
@@ -2971,6 +2971,17 @@
           <w:rFonts w:ascii="Calibri" w:cs="Calibri" w:eastAsia="Calibri" w:hAnsi="Calibri"/>
         </w:rPr>
         <w:t xml:space="preserve">3.2.2 Prueba de caja blanca: método registrar() de EvaluacionesService</w:t>
+      </w:r>
+    </w:p>
+    <w:p>
+      <w:pPr>
+        <w:spacing w:after="160" w:before="0"/>
+      </w:pPr>
+      <w:r>
+        <w:rPr>
+          <w:rFonts w:ascii="Calibri" w:cs="Calibri" w:eastAsia="Calibri" w:hAnsi="Calibri"/>
+        </w:rPr>
+        <w:t xml:space="preserve">El método registrar() es el que se ejecuta cuando un profesor califica a un estudiante en una de sus asignaturas: recibe el identificador del estudiante, el de la asignatura, la calificación (0 a 5) y una observación opcional, y guarda esa información como una evaluación. Si el estudiante ya tenía una evaluación registrada en esa asignatura, la actualiza en lugar de crear una nueva (es una operación de tipo upsert); por eso el mismo método atiende tanto el alta como la modificación de una evaluación. Antes de guardar, valida que el estudiante y la asignatura existan, que el profesor tenga permiso sobre esa asignatura, que la carrera del estudiante corresponda a una de las que cursa la asignatura y que la calificación esté en el rango permitido; y calcula automáticamente el estado de la evaluación (Aprobada si la calificación es 3 o más, Pendiente en caso contrario).</w:t>
       </w:r>
     </w:p>
     <w:p>

</xml_diff>